<commit_message>
rc4 and the full suite in the OE4 deliverable, chapter 9 and INCONSISTENCIAS; final dialogue button layout and help-intro unload fix recorded; OE4 republished (INC-152 to INC-160)
</commit_message>
<xml_diff>
--- a/docs/OE4/Anexo_A_Matriz_casos.docx
+++ b/docs/OE4/Anexo_A_Matriz_casos.docx
@@ -14587,7 +14587,7 @@
               <w:rPr>
                 <w:sz w:val="18"/>
               </w:rPr>
-              <w:t>PS</w:t>
+              <w:t>P</w:t>
             </w:r>
           </w:p>
         </w:tc>
@@ -14715,7 +14715,7 @@
               <w:rPr>
                 <w:sz w:val="18"/>
               </w:rPr>
-              <w:t>PS</w:t>
+              <w:t>P</w:t>
             </w:r>
           </w:p>
         </w:tc>
@@ -17276,7 +17276,7 @@
               <w:rPr>
                 <w:sz w:val="18"/>
               </w:rPr>
-              <w:t>PS</w:t>
+              <w:t>P</w:t>
             </w:r>
           </w:p>
         </w:tc>
@@ -17404,7 +17404,7 @@
               <w:rPr>
                 <w:sz w:val="18"/>
               </w:rPr>
-              <w:t>PS</w:t>
+              <w:t>P</w:t>
             </w:r>
           </w:p>
         </w:tc>
@@ -17532,7 +17532,7 @@
               <w:rPr>
                 <w:sz w:val="18"/>
               </w:rPr>
-              <w:t>PS</w:t>
+              <w:t>P</w:t>
             </w:r>
           </w:p>
         </w:tc>
@@ -17660,7 +17660,7 @@
               <w:rPr>
                 <w:sz w:val="18"/>
               </w:rPr>
-              <w:t>PS</w:t>
+              <w:t>P</w:t>
             </w:r>
           </w:p>
         </w:tc>
@@ -17865,7 +17865,7 @@
   <w:abstractNum w:abstractNumId="0" w15:restartNumberingAfterBreak="0">
     <w:nsid w:val="0000A990"/>
     <w:multiLevelType w:val="multilevel"/>
-    <w:tmpl w:val="01902D76"/>
+    <w:tmpl w:val="85B2A218"/>
     <w:lvl w:ilvl="0">
       <w:numFmt w:val="bullet"/>
       <w:lvlText w:val=" "/>
@@ -18138,16 +18138,16 @@
       </w:pPr>
     </w:lvl>
   </w:abstractNum>
-  <w:num w:numId="1" w16cid:durableId="1441798292">
+  <w:num w:numId="1" w16cid:durableId="351421409">
     <w:abstractNumId w:val="1"/>
   </w:num>
-  <w:num w:numId="2" w16cid:durableId="212081177">
+  <w:num w:numId="2" w16cid:durableId="1117409210">
     <w:abstractNumId w:val="2"/>
     <w:lvlOverride w:ilvl="0">
       <w:startOverride w:val="1"/>
     </w:lvlOverride>
   </w:num>
-  <w:num w:numId="3" w16cid:durableId="397898242">
+  <w:num w:numId="3" w16cid:durableId="1008171276">
     <w:abstractNumId w:val="0"/>
   </w:num>
 </w:numbering>
@@ -18953,7 +18953,7 @@
     <w:link w:val="EncabezadoCar"/>
     <w:uiPriority w:val="99"/>
     <w:unhideWhenUsed/>
-    <w:rsid w:val="00AB300F"/>
+    <w:rsid w:val="003C60B8"/>
     <w:pPr>
       <w:tabs>
         <w:tab w:val="center" w:pos="4419"/>
@@ -18967,7 +18967,7 @@
     <w:basedOn w:val="Fuentedeprrafopredeter"/>
     <w:link w:val="Encabezado"/>
     <w:uiPriority w:val="99"/>
-    <w:rsid w:val="00AB300F"/>
+    <w:rsid w:val="003C60B8"/>
   </w:style>
   <w:style w:type="paragraph" w:styleId="Piedepgina">
     <w:name w:val="footer"/>
@@ -18975,7 +18975,7 @@
     <w:link w:val="PiedepginaCar"/>
     <w:uiPriority w:val="99"/>
     <w:unhideWhenUsed/>
-    <w:rsid w:val="00AB300F"/>
+    <w:rsid w:val="003C60B8"/>
     <w:pPr>
       <w:tabs>
         <w:tab w:val="center" w:pos="4419"/>
@@ -18989,7 +18989,7 @@
     <w:basedOn w:val="Fuentedeprrafopredeter"/>
     <w:link w:val="Piedepgina"/>
     <w:uiPriority w:val="99"/>
-    <w:rsid w:val="00AB300F"/>
+    <w:rsid w:val="003C60B8"/>
   </w:style>
   <w:style w:type="character" w:styleId="Nmerodepgina">
     <w:name w:val="page number"/>
@@ -18997,7 +18997,7 @@
     <w:uiPriority w:val="99"/>
     <w:semiHidden/>
     <w:unhideWhenUsed/>
-    <w:rsid w:val="00AB300F"/>
+    <w:rsid w:val="003C60B8"/>
   </w:style>
 </w:styles>
 </file>

</xml_diff>

<commit_message>
rc4 figures, 129/133 efficacy and the 5.3 access paragraph synced into the thesis, chapter 9 source, OE3 and OE4 deliverables (republished); annexes H and I listed as pending signature (INC-151, DEF-RC3-05, -09, -10, -11)
</commit_message>
<xml_diff>
--- a/docs/OE4/Anexo_A_Matriz_casos.docx
+++ b/docs/OE4/Anexo_A_Matriz_casos.docx
@@ -15228,7 +15228,7 @@
               <w:rPr>
                 <w:sz w:val="18"/>
               </w:rPr>
-              <w:t>PS</w:t>
+              <w:t>P</w:t>
             </w:r>
           </w:p>
         </w:tc>
@@ -17865,7 +17865,7 @@
   <w:abstractNum w:abstractNumId="0" w15:restartNumberingAfterBreak="0">
     <w:nsid w:val="0000A990"/>
     <w:multiLevelType w:val="multilevel"/>
-    <w:tmpl w:val="85B2A218"/>
+    <w:tmpl w:val="FB4A0E6A"/>
     <w:lvl w:ilvl="0">
       <w:numFmt w:val="bullet"/>
       <w:lvlText w:val=" "/>
@@ -18138,16 +18138,16 @@
       </w:pPr>
     </w:lvl>
   </w:abstractNum>
-  <w:num w:numId="1" w16cid:durableId="351421409">
+  <w:num w:numId="1" w16cid:durableId="2030989594">
     <w:abstractNumId w:val="1"/>
   </w:num>
-  <w:num w:numId="2" w16cid:durableId="1117409210">
+  <w:num w:numId="2" w16cid:durableId="2141877318">
     <w:abstractNumId w:val="2"/>
     <w:lvlOverride w:ilvl="0">
       <w:startOverride w:val="1"/>
     </w:lvlOverride>
   </w:num>
-  <w:num w:numId="3" w16cid:durableId="1008171276">
+  <w:num w:numId="3" w16cid:durableId="399986130">
     <w:abstractNumId w:val="0"/>
   </w:num>
 </w:numbering>
@@ -18953,7 +18953,7 @@
     <w:link w:val="EncabezadoCar"/>
     <w:uiPriority w:val="99"/>
     <w:unhideWhenUsed/>
-    <w:rsid w:val="003C60B8"/>
+    <w:rsid w:val="00C24F69"/>
     <w:pPr>
       <w:tabs>
         <w:tab w:val="center" w:pos="4419"/>
@@ -18967,7 +18967,7 @@
     <w:basedOn w:val="Fuentedeprrafopredeter"/>
     <w:link w:val="Encabezado"/>
     <w:uiPriority w:val="99"/>
-    <w:rsid w:val="003C60B8"/>
+    <w:rsid w:val="00C24F69"/>
   </w:style>
   <w:style w:type="paragraph" w:styleId="Piedepgina">
     <w:name w:val="footer"/>
@@ -18975,7 +18975,7 @@
     <w:link w:val="PiedepginaCar"/>
     <w:uiPriority w:val="99"/>
     <w:unhideWhenUsed/>
-    <w:rsid w:val="003C60B8"/>
+    <w:rsid w:val="00C24F69"/>
     <w:pPr>
       <w:tabs>
         <w:tab w:val="center" w:pos="4419"/>
@@ -18989,7 +18989,7 @@
     <w:basedOn w:val="Fuentedeprrafopredeter"/>
     <w:link w:val="Piedepgina"/>
     <w:uiPriority w:val="99"/>
-    <w:rsid w:val="003C60B8"/>
+    <w:rsid w:val="00C24F69"/>
   </w:style>
   <w:style w:type="character" w:styleId="Nmerodepgina">
     <w:name w:val="page number"/>
@@ -18997,7 +18997,7 @@
     <w:uiPriority w:val="99"/>
     <w:semiHidden/>
     <w:unhideWhenUsed/>
-    <w:rsid w:val="003C60B8"/>
+    <w:rsid w:val="00C24F69"/>
   </w:style>
 </w:styles>
 </file>

</xml_diff>

<commit_message>
DEF-RC3-01 recorded as fixed in code after rc4 (86a9898) in the thesis, chapter 9 source and OE4 (republished); DEF-RC4-01 logged as an open observation (N3 summary card taller than 1080 px)
</commit_message>
<xml_diff>
--- a/docs/OE4/Anexo_A_Matriz_casos.docx
+++ b/docs/OE4/Anexo_A_Matriz_casos.docx
@@ -17865,7 +17865,7 @@
   <w:abstractNum w:abstractNumId="0" w15:restartNumberingAfterBreak="0">
     <w:nsid w:val="0000A990"/>
     <w:multiLevelType w:val="multilevel"/>
-    <w:tmpl w:val="FB4A0E6A"/>
+    <w:tmpl w:val="9146AC5A"/>
     <w:lvl w:ilvl="0">
       <w:numFmt w:val="bullet"/>
       <w:lvlText w:val=" "/>
@@ -18138,16 +18138,16 @@
       </w:pPr>
     </w:lvl>
   </w:abstractNum>
-  <w:num w:numId="1" w16cid:durableId="2030989594">
+  <w:num w:numId="1" w16cid:durableId="1253975418">
     <w:abstractNumId w:val="1"/>
   </w:num>
-  <w:num w:numId="2" w16cid:durableId="2141877318">
+  <w:num w:numId="2" w16cid:durableId="631640275">
     <w:abstractNumId w:val="2"/>
     <w:lvlOverride w:ilvl="0">
       <w:startOverride w:val="1"/>
     </w:lvlOverride>
   </w:num>
-  <w:num w:numId="3" w16cid:durableId="399986130">
+  <w:num w:numId="3" w16cid:durableId="1673532529">
     <w:abstractNumId w:val="0"/>
   </w:num>
 </w:numbering>
@@ -18953,7 +18953,7 @@
     <w:link w:val="EncabezadoCar"/>
     <w:uiPriority w:val="99"/>
     <w:unhideWhenUsed/>
-    <w:rsid w:val="00C24F69"/>
+    <w:rsid w:val="00450127"/>
     <w:pPr>
       <w:tabs>
         <w:tab w:val="center" w:pos="4419"/>
@@ -18967,7 +18967,7 @@
     <w:basedOn w:val="Fuentedeprrafopredeter"/>
     <w:link w:val="Encabezado"/>
     <w:uiPriority w:val="99"/>
-    <w:rsid w:val="00C24F69"/>
+    <w:rsid w:val="00450127"/>
   </w:style>
   <w:style w:type="paragraph" w:styleId="Piedepgina">
     <w:name w:val="footer"/>
@@ -18975,7 +18975,7 @@
     <w:link w:val="PiedepginaCar"/>
     <w:uiPriority w:val="99"/>
     <w:unhideWhenUsed/>
-    <w:rsid w:val="00C24F69"/>
+    <w:rsid w:val="00450127"/>
     <w:pPr>
       <w:tabs>
         <w:tab w:val="center" w:pos="4419"/>
@@ -18989,7 +18989,7 @@
     <w:basedOn w:val="Fuentedeprrafopredeter"/>
     <w:link w:val="Piedepgina"/>
     <w:uiPriority w:val="99"/>
-    <w:rsid w:val="00C24F69"/>
+    <w:rsid w:val="00450127"/>
   </w:style>
   <w:style w:type="character" w:styleId="Nmerodepgina">
     <w:name w:val="page number"/>
@@ -18997,7 +18997,7 @@
     <w:uiPriority w:val="99"/>
     <w:semiHidden/>
     <w:unhideWhenUsed/>
-    <w:rsid w:val="00C24F69"/>
+    <w:rsid w:val="00450127"/>
   </w:style>
 </w:styles>
 </file>

</xml_diff>

<commit_message>
Close DEF-RC3-I04 with the rc5 suite and add school PC measurement
- Full suite on 06a5b61 (same Assets/Packages/ProjectSettings as rc5,
  ca6fd91): EditMode 795/796 (1 skipped), PlayMode 438/438, 1234/1234
  listed tests run (evidencias/suites/rc5-06a5b61)
- RNF-04/RNF-05 on rc5 on one school PC (AMD A10-9600P, 3.9 GB, Level 1
  only): worst load 1.223 s, peak private memory 633 MiB
  (evidencias/rc5/medicion-colegio)
- OE4 chapters 1-6 updated and republished; OE4-Resultados note 18
- Thesis: DEF-RC3-I04 out of future work (four remain), rc5 suite and
  school measurement in chapter 9 and conclusions; still 90 pages
- CLAUDE.md rc5 status line
</commit_message>
<xml_diff>
--- a/docs/OE4/Anexo_A_Matriz_casos.docx
+++ b/docs/OE4/Anexo_A_Matriz_casos.docx
@@ -15356,7 +15356,7 @@
               <w:rPr>
                 <w:sz w:val="18"/>
               </w:rPr>
-              <w:t>PS</w:t>
+              <w:t>P</w:t>
             </w:r>
           </w:p>
         </w:tc>
@@ -17020,7 +17020,7 @@
               <w:rPr>
                 <w:sz w:val="18"/>
               </w:rPr>
-              <w:t>PS</w:t>
+              <w:t>P</w:t>
             </w:r>
           </w:p>
         </w:tc>
@@ -17148,7 +17148,7 @@
               <w:rPr>
                 <w:sz w:val="18"/>
               </w:rPr>
-              <w:t>PS</w:t>
+              <w:t>P</w:t>
             </w:r>
           </w:p>
         </w:tc>
@@ -17865,7 +17865,7 @@
   <w:abstractNum w:abstractNumId="0" w15:restartNumberingAfterBreak="0">
     <w:nsid w:val="0000A990"/>
     <w:multiLevelType w:val="multilevel"/>
-    <w:tmpl w:val="FF4A4A26"/>
+    <w:tmpl w:val="EE0828F8"/>
     <w:lvl w:ilvl="0">
       <w:numFmt w:val="bullet"/>
       <w:lvlText w:val=" "/>
@@ -18138,16 +18138,16 @@
       </w:pPr>
     </w:lvl>
   </w:abstractNum>
-  <w:num w:numId="1" w16cid:durableId="1562249531">
+  <w:num w:numId="1" w16cid:durableId="302934401">
     <w:abstractNumId w:val="1"/>
   </w:num>
-  <w:num w:numId="2" w16cid:durableId="237830463">
+  <w:num w:numId="2" w16cid:durableId="877936857">
     <w:abstractNumId w:val="2"/>
     <w:lvlOverride w:ilvl="0">
       <w:startOverride w:val="1"/>
     </w:lvlOverride>
   </w:num>
-  <w:num w:numId="3" w16cid:durableId="455221436">
+  <w:num w:numId="3" w16cid:durableId="1134907833">
     <w:abstractNumId w:val="0"/>
   </w:num>
 </w:numbering>
@@ -18953,7 +18953,7 @@
     <w:link w:val="EncabezadoCar"/>
     <w:uiPriority w:val="99"/>
     <w:unhideWhenUsed/>
-    <w:rsid w:val="00300CC5"/>
+    <w:rsid w:val="00654962"/>
     <w:pPr>
       <w:tabs>
         <w:tab w:val="center" w:pos="4419"/>
@@ -18967,7 +18967,7 @@
     <w:basedOn w:val="Fuentedeprrafopredeter"/>
     <w:link w:val="Encabezado"/>
     <w:uiPriority w:val="99"/>
-    <w:rsid w:val="00300CC5"/>
+    <w:rsid w:val="00654962"/>
   </w:style>
   <w:style w:type="paragraph" w:styleId="Piedepgina">
     <w:name w:val="footer"/>
@@ -18975,7 +18975,7 @@
     <w:link w:val="PiedepginaCar"/>
     <w:uiPriority w:val="99"/>
     <w:unhideWhenUsed/>
-    <w:rsid w:val="00300CC5"/>
+    <w:rsid w:val="00654962"/>
     <w:pPr>
       <w:tabs>
         <w:tab w:val="center" w:pos="4419"/>
@@ -18989,7 +18989,7 @@
     <w:basedOn w:val="Fuentedeprrafopredeter"/>
     <w:link w:val="Piedepgina"/>
     <w:uiPriority w:val="99"/>
-    <w:rsid w:val="00300CC5"/>
+    <w:rsid w:val="00654962"/>
   </w:style>
   <w:style w:type="character" w:styleId="Nmerodepgina">
     <w:name w:val="page number"/>
@@ -18997,7 +18997,7 @@
     <w:uiPriority w:val="99"/>
     <w:semiHidden/>
     <w:unhideWhenUsed/>
-    <w:rsid w:val="00300CC5"/>
+    <w:rsid w:val="00654962"/>
   </w:style>
 </w:styles>
 </file>

</xml_diff>